<commit_message>
Align docs with pipeline scaffold
</commit_message>
<xml_diff>
--- a/docs/Pixel_Town_3D_POC_Handoff.docx
+++ b/docs/Pixel_Town_3D_POC_Handoff.docx
@@ -4,1123 +4,668 @@
   <w:body>
     <w:p>
       <w:pPr>
-        <w:pStyle w:val="Title"/>
+        <w:spacing w:after="40"/>
         <w:jc w:val="center"/>
       </w:pPr>
       <w:r>
-        <w:t>Codex Handoff: Pixel-Art Seaside Town 3D World POC</w:t>
+        <w:rPr>
+          <w:rFonts w:ascii="Arial" w:hAnsi="Arial"/>
+          <w:b/>
+          <w:color w:val="16324F"/>
+          <w:sz w:val="40"/>
+        </w:rPr>
+        <w:t>Pixel Town 3D Asset Pipeline POC</w:t>
       </w:r>
     </w:p>
     <w:p>
       <w:pPr>
+        <w:spacing w:after="280"/>
         <w:jc w:val="center"/>
       </w:pPr>
       <w:r>
-        <w:t>Prepared as a Codex-ready project handoff and implementation brief.</w:t>
+        <w:rPr>
+          <w:rFonts w:ascii="Arial" w:hAnsi="Arial"/>
+          <w:b w:val="0"/>
+          <w:color w:val="555555"/>
+          <w:sz w:val="20"/>
+        </w:rPr>
+        <w:t>Current Codex handoff and implementation brief</w:t>
       </w:r>
     </w:p>
     <w:p>
       <w:pPr>
         <w:pStyle w:val="Heading1"/>
+        <w:spacing w:before="280" w:after="100"/>
       </w:pPr>
       <w:r>
+        <w:rPr>
+          <w:rFonts w:ascii="Arial" w:hAnsi="Arial"/>
+          <w:b/>
+          <w:color w:val="16324F"/>
+          <w:sz w:val="32"/>
+        </w:rPr>
         <w:t>Goal</w:t>
       </w:r>
     </w:p>
     <w:p>
+      <w:pPr>
+        <w:spacing w:after="120" w:line="259" w:lineRule="auto"/>
+      </w:pPr>
       <w:r>
-        <w:t>Build a proof of concept that uses the generated ultra-wide pixel-art seaside town image as art direction and layout reference, then turns selected objects into reusable 3D assets for a navigable browser world.</w:t>
+        <w:rPr>
+          <w:rFonts w:ascii="Arial" w:hAnsi="Arial"/>
+          <w:b w:val="0"/>
+          <w:color w:val="111111"/>
+          <w:sz w:val="20"/>
+        </w:rPr>
+        <w:t>Build a proof of concept that turns a generated pixel-art seaside town panorama into a stylised 3D world through an incremental asset pipeline.</w:t>
       </w:r>
     </w:p>
     <w:p>
+      <w:pPr>
+        <w:spacing w:after="120" w:line="259" w:lineRule="auto"/>
+      </w:pPr>
       <w:r>
-        <w:t>The project should remain pragmatic: use AI image-to-3D generation where it helps, but use procedural/manual geometry for roads, poles, walls, wires, ocean, sky, and repeated simple structures.</w:t>
+        <w:rPr>
+          <w:rFonts w:ascii="Arial" w:hAnsi="Arial"/>
+          <w:b w:val="0"/>
+          <w:color w:val="111111"/>
+          <w:sz w:val="20"/>
+        </w:rPr>
+        <w:t>The current repository is focused on pipeline scaffolding. It does not yet contain the full Three.js world implementation or source panorama assets.</w:t>
       </w:r>
     </w:p>
     <w:p>
       <w:pPr>
         <w:pStyle w:val="Heading1"/>
+        <w:spacing w:before="280" w:after="100"/>
       </w:pPr>
       <w:r>
-        <w:t>Current deliverable</w:t>
-      </w:r>
-    </w:p>
-    <w:p>
-      <w:r>
-        <w:t>This folder contains a working scaffold:</w:t>
+        <w:rPr>
+          <w:rFonts w:ascii="Arial" w:hAnsi="Arial"/>
+          <w:b/>
+          <w:color w:val="16324F"/>
+          <w:sz w:val="32"/>
+        </w:rPr>
+        <w:t>Current Repository Shape</w:t>
       </w:r>
     </w:p>
     <w:p>
       <w:pPr>
-        <w:spacing w:before="60" w:after="120"/>
+        <w:spacing w:before="60" w:after="140"/>
         <w:ind w:left="360"/>
-        <w:shd w:fill="F2F4F7"/>
       </w:pPr>
       <w:r>
         <w:rPr>
           <w:rFonts w:ascii="Consolas" w:hAnsi="Consolas"/>
+          <w:color w:val="333333"/>
           <w:sz w:val="17"/>
         </w:rPr>
         <w:t>pixel-town-poc/</w:t>
         <w:br/>
         <w:t xml:space="preserve">  index.html</w:t>
         <w:br/>
-        <w:t xml:space="preserve">  src/main.js</w:t>
+        <w:t xml:space="preserve">  scripts/parse_scene.py</w:t>
         <w:br/>
-        <w:t xml:space="preserve">  scripts/prepare_assets.py</w:t>
+        <w:t xml:space="preserve">  scripts/route_assets.py</w:t>
         <w:br/>
-        <w:t xml:space="preserve">  scripts/generate_proxy_glbs.py</w:t>
+        <w:t xml:space="preserve">  scripts/generate_clean_asset_image.py</w:t>
         <w:br/>
-        <w:t xml:space="preserve">  scripts/run_local.sh</w:t>
+        <w:t xml:space="preserve">  scripts/run_image_to_3d_asset.py</w:t>
         <w:br/>
-        <w:t xml:space="preserve">  config/crop_config.json</w:t>
+        <w:t xml:space="preserve">  assets/scene_parse.json</w:t>
         <w:br/>
-        <w:t xml:space="preserve">  scene/town_layout.json</w:t>
+        <w:t xml:space="preserve">  assets/asset_routes.json</w:t>
         <w:br/>
-        <w:t xml:space="preserve">  assets/source/panorama.png</w:t>
+        <w:t xml:space="preserve">  assets/intermediate/shrine_01_clean.txt</w:t>
         <w:br/>
-        <w:t xml:space="preserve">  assets/crops/*.png</w:t>
+        <w:t xml:space="preserve">  assets/intermediate/shrine_01_clean_meta.json</w:t>
         <w:br/>
-        <w:t xml:space="preserve">  assets/glb/*.glb</w:t>
+        <w:t xml:space="preserve">  assets/generated/shrine_01_raw.glb</w:t>
         <w:br/>
-        <w:t xml:space="preserve">  decisions/asset_review.md</w:t>
-      </w:r>
-    </w:p>
-    <w:p>
-      <w:r>
-        <w:t>Run it with:</w:t>
+        <w:t xml:space="preserve">  assets/generated/shrine_01_generation_meta.json</w:t>
+        <w:br/>
+        <w:t xml:space="preserve">  assets/generated/shrine_01_notes.md</w:t>
+        <w:br/>
+        <w:t xml:space="preserve">  docs/SCRIPT_INTERFACES.md</w:t>
       </w:r>
     </w:p>
     <w:p>
       <w:pPr>
-        <w:spacing w:before="60" w:after="120"/>
-        <w:ind w:left="360"/>
-        <w:shd w:fill="F2F4F7"/>
+        <w:spacing w:after="120" w:line="259" w:lineRule="auto"/>
       </w:pPr>
       <w:r>
         <w:rPr>
-          <w:rFonts w:ascii="Consolas" w:hAnsi="Consolas"/>
-          <w:sz w:val="17"/>
+          <w:rFonts w:ascii="Arial" w:hAnsi="Arial"/>
+          <w:b w:val="0"/>
+          <w:color w:val="111111"/>
+          <w:sz w:val="20"/>
         </w:rPr>
-        <w:t>cd pixel-town-poc</w:t>
-        <w:br/>
-        <w:t>./scripts/run_local.sh</w:t>
-      </w:r>
-    </w:p>
-    <w:p>
-      <w:r>
-        <w:t xml:space="preserve">Open </w:t>
-      </w:r>
-      <w:r>
-        <w:rPr>
-          <w:rFonts w:ascii="Consolas" w:hAnsi="Consolas"/>
-          <w:sz w:val="18"/>
-        </w:rPr>
-        <w:t>http://localhost:8000</w:t>
-      </w:r>
-      <w:r>
-        <w:t>.</w:t>
+        <w:t>index.html is present but references ./src/main.js, which is not in this checkout. Treat the browser viewer as a future or restoration task.</w:t>
       </w:r>
     </w:p>
     <w:p>
       <w:pPr>
         <w:pStyle w:val="Heading1"/>
+        <w:spacing w:before="280" w:after="100"/>
       </w:pPr>
       <w:r>
-        <w:t>Design direction</w:t>
+        <w:rPr>
+          <w:rFonts w:ascii="Arial" w:hAnsi="Arial"/>
+          <w:b/>
+          <w:color w:val="16324F"/>
+          <w:sz w:val="32"/>
+        </w:rPr>
+        <w:t>Current Working Pipeline</w:t>
       </w:r>
     </w:p>
     <w:p>
+      <w:pPr>
+        <w:spacing w:before="60" w:after="140"/>
+        <w:ind w:left="360"/>
+      </w:pPr>
       <w:r>
-        <w:t>The desired final feeling is a 3D diorama rendered like pixel art, not a realistic 3D reconstruction. Preserve:</w:t>
+        <w:rPr>
+          <w:rFonts w:ascii="Consolas" w:hAnsi="Consolas"/>
+          <w:color w:val="333333"/>
+          <w:sz w:val="17"/>
+        </w:rPr>
+        <w:t>python3 scripts/parse_scene.py --image assets/source/panorama.png --out assets/scene_parse.json</w:t>
+        <w:br/>
+        <w:t>python3 scripts/route_assets.py --scene assets/scene_parse.json --out assets/asset_routes.json</w:t>
+        <w:br/>
+        <w:t>python3 scripts/generate_clean_asset_image.py --asset shrine_01 --scene assets/scene_parse.json --mode clean-render --outdir assets/intermediate</w:t>
+        <w:br/>
+        <w:t>python3 scripts/run_image_to_3d_asset.py --asset shrine_01 --scene assets/scene_parse.json --routes assets/asset_routes.json --mode clean-render --backend stub --outdir assets/generated</w:t>
+      </w:r>
+    </w:p>
+    <w:p>
+      <w:pPr>
+        <w:spacing w:after="120" w:line="259" w:lineRule="auto"/>
+      </w:pPr>
+      <w:r>
+        <w:rPr>
+          <w:rFonts w:ascii="Arial" w:hAnsi="Arial"/>
+          <w:b w:val="0"/>
+          <w:color w:val="111111"/>
+          <w:sz w:val="20"/>
+        </w:rPr>
+        <w:t>The parser currently records the --image path as metadata only; it does not open or validate the image file.</w:t>
+      </w:r>
+    </w:p>
+    <w:p>
+      <w:pPr>
+        <w:pStyle w:val="Heading1"/>
+        <w:spacing w:before="280" w:after="100"/>
+      </w:pPr>
+      <w:r>
+        <w:rPr>
+          <w:rFonts w:ascii="Arial" w:hAnsi="Arial"/>
+          <w:b/>
+          <w:color w:val="16324F"/>
+          <w:sz w:val="32"/>
+        </w:rPr>
+        <w:t>Implemented Now</w:t>
       </w:r>
     </w:p>
     <w:p>
       <w:pPr>
         <w:pStyle w:val="ListBullet"/>
+        <w:spacing w:after="60"/>
       </w:pPr>
       <w:r>
-        <w:t>bright cyan sky,</w:t>
+        <w:rPr>
+          <w:rFonts w:ascii="Arial" w:hAnsi="Arial"/>
+          <w:b w:val="0"/>
+          <w:color w:val="111111"/>
+          <w:sz w:val="20"/>
+        </w:rPr>
+        <w:t>Stub scene parser that emits a deterministic starter object inventory.</w:t>
       </w:r>
     </w:p>
     <w:p>
       <w:pPr>
         <w:pStyle w:val="ListBullet"/>
+        <w:spacing w:after="60"/>
       </w:pPr>
       <w:r>
-        <w:t>seaside Japanese-town atmosphere,</w:t>
+        <w:rPr>
+          <w:rFonts w:ascii="Arial" w:hAnsi="Arial"/>
+          <w:b w:val="0"/>
+          <w:color w:val="111111"/>
+          <w:sz w:val="20"/>
+        </w:rPr>
+        <w:t>Stub asset router that assigns each object to a generation strategy.</w:t>
       </w:r>
     </w:p>
     <w:p>
       <w:pPr>
         <w:pStyle w:val="ListBullet"/>
+        <w:spacing w:after="60"/>
       </w:pPr>
       <w:r>
-        <w:t>blue roofs,</w:t>
+        <w:rPr>
+          <w:rFonts w:ascii="Arial" w:hAnsi="Arial"/>
+          <w:b w:val="0"/>
+          <w:color w:val="111111"/>
+          <w:sz w:val="20"/>
+        </w:rPr>
+        <w:t>Stub clean-asset-image generator that writes prompt metadata and a text placeholder.</w:t>
       </w:r>
     </w:p>
     <w:p>
       <w:pPr>
         <w:pStyle w:val="ListBullet"/>
+        <w:spacing w:after="60"/>
       </w:pPr>
       <w:r>
-        <w:t>utility poles and wires,</w:t>
+        <w:rPr>
+          <w:rFonts w:ascii="Arial" w:hAnsi="Arial"/>
+          <w:b w:val="0"/>
+          <w:color w:val="111111"/>
+          <w:sz w:val="20"/>
+        </w:rPr>
+        <w:t>Stub image-to-3D runner that writes placeholder GLB bytes, metadata, and notes.</w:t>
       </w:r>
     </w:p>
     <w:p>
       <w:pPr>
         <w:pStyle w:val="ListBullet"/>
+        <w:spacing w:after="60"/>
       </w:pPr>
       <w:r>
-        <w:t>temple/shrine,</w:t>
+        <w:rPr>
+          <w:rFonts w:ascii="Arial" w:hAnsi="Arial"/>
+          <w:b w:val="0"/>
+          <w:color w:val="111111"/>
+          <w:sz w:val="20"/>
+        </w:rPr>
+        <w:t>Sample generated outputs for shrine_01.</w:t>
+      </w:r>
+    </w:p>
+    <w:p>
+      <w:pPr>
+        <w:pStyle w:val="Heading1"/>
+        <w:spacing w:before="280" w:after="100"/>
+      </w:pPr>
+      <w:r>
+        <w:rPr>
+          <w:rFonts w:ascii="Arial" w:hAnsi="Arial"/>
+          <w:b/>
+          <w:color w:val="16324F"/>
+          <w:sz w:val="32"/>
+        </w:rPr>
+        <w:t>Not Implemented Yet</w:t>
       </w:r>
     </w:p>
     <w:p>
       <w:pPr>
         <w:pStyle w:val="ListBullet"/>
+        <w:spacing w:after="60"/>
       </w:pPr>
       <w:r>
-        <w:t>station/train stop,</w:t>
+        <w:rPr>
+          <w:rFonts w:ascii="Arial" w:hAnsi="Arial"/>
+          <w:b w:val="0"/>
+          <w:color w:val="111111"/>
+          <w:sz w:val="20"/>
+        </w:rPr>
+        <w:t>Real VLM scene parsing.</w:t>
       </w:r>
     </w:p>
     <w:p>
       <w:pPr>
         <w:pStyle w:val="ListBullet"/>
+        <w:spacing w:after="60"/>
       </w:pPr>
       <w:r>
-        <w:t>park/playground,</w:t>
+        <w:rPr>
+          <w:rFonts w:ascii="Arial" w:hAnsi="Arial"/>
+          <w:b w:val="0"/>
+          <w:color w:val="111111"/>
+          <w:sz w:val="20"/>
+        </w:rPr>
+        <w:t>Real image generation for clean intermediate asset images.</w:t>
       </w:r>
     </w:p>
     <w:p>
       <w:pPr>
         <w:pStyle w:val="ListBullet"/>
+        <w:spacing w:after="60"/>
       </w:pPr>
       <w:r>
-        <w:t>road intersection,</w:t>
+        <w:rPr>
+          <w:rFonts w:ascii="Arial" w:hAnsi="Arial"/>
+          <w:b w:val="0"/>
+          <w:color w:val="111111"/>
+          <w:sz w:val="20"/>
+        </w:rPr>
+        <w:t>Real image-to-3D backend invocation.</w:t>
       </w:r>
     </w:p>
     <w:p>
       <w:pPr>
         <w:pStyle w:val="ListBullet"/>
+        <w:spacing w:after="60"/>
       </w:pPr>
       <w:r>
-        <w:t>ocean and green mountains,</w:t>
+        <w:rPr>
+          <w:rFonts w:ascii="Arial" w:hAnsi="Arial"/>
+          <w:b w:val="0"/>
+          <w:color w:val="111111"/>
+          <w:sz w:val="20"/>
+        </w:rPr>
+        <w:t>Valid generated GLB geometry.</w:t>
       </w:r>
     </w:p>
     <w:p>
       <w:pPr>
         <w:pStyle w:val="ListBullet"/>
+        <w:spacing w:after="60"/>
       </w:pPr>
       <w:r>
-        <w:t>crisp blocky pixel-art colours and shading.</w:t>
+        <w:rPr>
+          <w:rFonts w:ascii="Arial" w:hAnsi="Arial"/>
+          <w:b w:val="0"/>
+          <w:color w:val="111111"/>
+          <w:sz w:val="20"/>
+        </w:rPr>
+        <w:t>Blender cleanup and normalisation.</w:t>
+      </w:r>
+    </w:p>
+    <w:p>
+      <w:pPr>
+        <w:pStyle w:val="ListBullet"/>
+        <w:spacing w:after="60"/>
+      </w:pPr>
+      <w:r>
+        <w:rPr>
+          <w:rFonts w:ascii="Arial" w:hAnsi="Arial"/>
+          <w:b w:val="0"/>
+          <w:color w:val="111111"/>
+          <w:sz w:val="20"/>
+        </w:rPr>
+        <w:t>Browser scene implementation under src/main.js.</w:t>
+      </w:r>
+    </w:p>
+    <w:p>
+      <w:pPr>
+        <w:pStyle w:val="ListBullet"/>
+        <w:spacing w:after="60"/>
+      </w:pPr>
+      <w:r>
+        <w:rPr>
+          <w:rFonts w:ascii="Arial" w:hAnsi="Arial"/>
+          <w:b w:val="0"/>
+          <w:color w:val="111111"/>
+          <w:sz w:val="20"/>
+        </w:rPr>
+        <w:t>Source panorama and crop-generation assets in this checkout.</w:t>
       </w:r>
     </w:p>
     <w:p>
       <w:pPr>
         <w:pStyle w:val="Heading1"/>
+        <w:spacing w:before="280" w:after="100"/>
       </w:pPr>
       <w:r>
-        <w:t>Why this starts with proxy assets</w:t>
-      </w:r>
-    </w:p>
-    <w:p>
-      <w:r>
-        <w:t>Single-image-to-3D scene conversion is not reliable enough to convert the whole panorama into a coherent world in one pass. This scaffold uses the source image for:</w:t>
+        <w:rPr>
+          <w:rFonts w:ascii="Arial" w:hAnsi="Arial"/>
+          <w:b/>
+          <w:color w:val="16324F"/>
+          <w:sz w:val="32"/>
+        </w:rPr>
+        <w:t>Recommended Next Technical Iteration</w:t>
       </w:r>
     </w:p>
     <w:p>
       <w:pPr>
-        <w:pStyle w:val="ListNumber"/>
+        <w:pStyle w:val="ListBullet"/>
+        <w:spacing w:after="60"/>
       </w:pPr>
       <w:r>
-        <w:t>layout reference,</w:t>
+        <w:rPr>
+          <w:rFonts w:ascii="Arial" w:hAnsi="Arial"/>
+          <w:b w:val="0"/>
+          <w:color w:val="111111"/>
+          <w:sz w:val="20"/>
+        </w:rPr>
+        <w:t>Add or restore assets/source/panorama.png.</w:t>
       </w:r>
     </w:p>
     <w:p>
       <w:pPr>
-        <w:pStyle w:val="ListNumber"/>
+        <w:pStyle w:val="ListBullet"/>
+        <w:spacing w:after="60"/>
       </w:pPr>
       <w:r>
-        <w:t>asset crop extraction,</w:t>
+        <w:rPr>
+          <w:rFonts w:ascii="Arial" w:hAnsi="Arial"/>
+          <w:b w:val="0"/>
+          <w:color w:val="111111"/>
+          <w:sz w:val="20"/>
+        </w:rPr>
+        <w:t>Add validation that distinguishes placeholder GLB files from valid GLB assets.</w:t>
       </w:r>
     </w:p>
     <w:p>
       <w:pPr>
-        <w:pStyle w:val="ListNumber"/>
+        <w:pStyle w:val="ListBullet"/>
+        <w:spacing w:after="60"/>
       </w:pPr>
       <w:r>
-        <w:t>colour/style reference,</w:t>
+        <w:rPr>
+          <w:rFonts w:ascii="Arial" w:hAnsi="Arial"/>
+          <w:b w:val="0"/>
+          <w:color w:val="111111"/>
+          <w:sz w:val="20"/>
+        </w:rPr>
+        <w:t>Connect one real clean-image backend while preserving --backend stub.</w:t>
       </w:r>
     </w:p>
     <w:p>
       <w:pPr>
-        <w:pStyle w:val="ListNumber"/>
+        <w:pStyle w:val="ListBullet"/>
+        <w:spacing w:after="60"/>
       </w:pPr>
       <w:r>
-        <w:t>visual backdrop while the 3D scene is built.</w:t>
+        <w:rPr>
+          <w:rFonts w:ascii="Arial" w:hAnsi="Arial"/>
+          <w:b w:val="0"/>
+          <w:color w:val="111111"/>
+          <w:sz w:val="20"/>
+        </w:rPr>
+        <w:t>Connect one real image-to-3D backend while preserving --backend stub.</w:t>
       </w:r>
     </w:p>
     <w:p>
+      <w:pPr>
+        <w:pStyle w:val="ListBullet"/>
+        <w:spacing w:after="60"/>
+      </w:pPr>
       <w:r>
-        <w:t>The proxy GLBs are intentionally simple. They let us test scale, placement, camera style, browser rendering, and asset replacement workflow before spending time on heavier 3D generation.</w:t>
+        <w:rPr>
+          <w:rFonts w:ascii="Arial" w:hAnsi="Arial"/>
+          <w:b w:val="0"/>
+          <w:color w:val="111111"/>
+          <w:sz w:val="20"/>
+        </w:rPr>
+        <w:t>Rebuild or restore the Three.js viewer under src/main.js.</w:t>
       </w:r>
     </w:p>
     <w:p>
       <w:pPr>
         <w:pStyle w:val="Heading1"/>
+        <w:spacing w:before="280" w:after="100"/>
       </w:pPr>
       <w:r>
-        <w:t>Automated pipeline already included</w:t>
-      </w:r>
-    </w:p>
-    <w:p>
-      <w:pPr>
-        <w:pStyle w:val="Heading2"/>
-      </w:pPr>
-      <w:r>
-        <w:t>`scripts/prepare_assets.py`</w:t>
-      </w:r>
-    </w:p>
-    <w:p>
-      <w:r>
-        <w:t xml:space="preserve">Reads </w:t>
-      </w:r>
-      <w:r>
         <w:rPr>
-          <w:rFonts w:ascii="Consolas" w:hAnsi="Consolas"/>
-          <w:sz w:val="18"/>
+          <w:rFonts w:ascii="Arial" w:hAnsi="Arial"/>
+          <w:b/>
+          <w:color w:val="16324F"/>
+          <w:sz w:val="32"/>
         </w:rPr>
-        <w:t>config/crop_config.json</w:t>
-      </w:r>
-      <w:r>
-        <w:t>, then:</w:t>
+        <w:t>Human Decision Points</w:t>
       </w:r>
     </w:p>
     <w:p>
       <w:pPr>
         <w:pStyle w:val="ListBullet"/>
+        <w:spacing w:after="60"/>
       </w:pPr>
       <w:r>
-        <w:t>opens `assets/source/panorama.png`,</w:t>
+        <w:rPr>
+          <w:rFonts w:ascii="Arial" w:hAnsi="Arial"/>
+          <w:b w:val="0"/>
+          <w:color w:val="111111"/>
+          <w:sz w:val="20"/>
+        </w:rPr>
+        <w:t>Confirm whether the stub scene inventory has the right objects and priorities.</w:t>
       </w:r>
     </w:p>
     <w:p>
       <w:pPr>
         <w:pStyle w:val="ListBullet"/>
+        <w:spacing w:after="60"/>
       </w:pPr>
       <w:r>
-        <w:t>crops named objects into `assets/crops/`,</w:t>
+        <w:rPr>
+          <w:rFonts w:ascii="Arial" w:hAnsi="Arial"/>
+          <w:b w:val="0"/>
+          <w:color w:val="111111"/>
+          <w:sz w:val="20"/>
+        </w:rPr>
+        <w:t>Confirm whether each object route is correct.</w:t>
       </w:r>
     </w:p>
     <w:p>
       <w:pPr>
         <w:pStyle w:val="ListBullet"/>
+        <w:spacing w:after="60"/>
       </w:pPr>
       <w:r>
-        <w:t>creates a 32-colour palette preview,</w:t>
+        <w:rPr>
+          <w:rFonts w:ascii="Arial" w:hAnsi="Arial"/>
+          <w:b w:val="0"/>
+          <w:color w:val="111111"/>
+          <w:sz w:val="20"/>
+        </w:rPr>
+        <w:t>Choose the first real backend test asset: shrine_01, house_blue_01, or vending_machine_01.</w:t>
       </w:r>
     </w:p>
     <w:p>
       <w:pPr>
         <w:pStyle w:val="ListBullet"/>
+        <w:spacing w:after="60"/>
       </w:pPr>
       <w:r>
-        <w:t>writes `assets/asset_manifest.json`,</w:t>
+        <w:rPr>
+          <w:rFonts w:ascii="Arial" w:hAnsi="Arial"/>
+          <w:b w:val="0"/>
+          <w:color w:val="111111"/>
+          <w:sz w:val="20"/>
+        </w:rPr>
+        <w:t>Decide whether to prioritize the browser viewer or real asset generation next.</w:t>
+      </w:r>
+    </w:p>
+    <w:p>
+      <w:pPr>
+        <w:pStyle w:val="Heading1"/>
+        <w:spacing w:before="280" w:after="100"/>
+      </w:pPr>
+      <w:r>
+        <w:rPr>
+          <w:rFonts w:ascii="Arial" w:hAnsi="Arial"/>
+          <w:b/>
+          <w:color w:val="16324F"/>
+          <w:sz w:val="32"/>
+        </w:rPr>
+        <w:t>Definition Of Done For The Next Milestone</w:t>
       </w:r>
     </w:p>
     <w:p>
       <w:pPr>
         <w:pStyle w:val="ListBullet"/>
+        <w:spacing w:after="60"/>
       </w:pPr>
       <w:r>
-        <w:t>writes review prompts into `decisions/asset_review.md`.</w:t>
-      </w:r>
-    </w:p>
-    <w:p>
-      <w:pPr>
-        <w:pStyle w:val="Heading2"/>
-      </w:pPr>
-      <w:r>
-        <w:t>`scripts/generate_proxy_glbs.py`</w:t>
-      </w:r>
-    </w:p>
-    <w:p>
-      <w:r>
-        <w:t xml:space="preserve">Creates deterministic procedural GLB placeholders using </w:t>
-      </w:r>
-      <w:r>
         <w:rPr>
-          <w:rFonts w:ascii="Consolas" w:hAnsi="Consolas"/>
-          <w:sz w:val="18"/>
+          <w:rFonts w:ascii="Arial" w:hAnsi="Arial"/>
+          <w:b w:val="0"/>
+          <w:color w:val="111111"/>
+          <w:sz w:val="20"/>
         </w:rPr>
-        <w:t>trimesh</w:t>
-      </w:r>
-      <w:r>
-        <w:t>:</w:t>
+        <w:t>One real backend path is wired behind the existing CLI.</w:t>
       </w:r>
     </w:p>
     <w:p>
       <w:pPr>
         <w:pStyle w:val="ListBullet"/>
+        <w:spacing w:after="60"/>
       </w:pPr>
       <w:r>
-        <w:t>`house_blue_proxy.glb`,</w:t>
+        <w:rPr>
+          <w:rFonts w:ascii="Arial" w:hAnsi="Arial"/>
+          <w:b w:val="0"/>
+          <w:color w:val="111111"/>
+          <w:sz w:val="20"/>
+        </w:rPr>
+        <w:t>--backend stub still works for fast tests.</w:t>
       </w:r>
     </w:p>
     <w:p>
       <w:pPr>
         <w:pStyle w:val="ListBullet"/>
+        <w:spacing w:after="60"/>
       </w:pPr>
       <w:r>
-        <w:t>`shrine_proxy.glb`,</w:t>
+        <w:rPr>
+          <w:rFonts w:ascii="Arial" w:hAnsi="Arial"/>
+          <w:b w:val="0"/>
+          <w:color w:val="111111"/>
+          <w:sz w:val="20"/>
+        </w:rPr>
+        <w:t>Generated artifacts include metadata and review notes.</w:t>
       </w:r>
     </w:p>
     <w:p>
       <w:pPr>
         <w:pStyle w:val="ListBullet"/>
+        <w:spacing w:after="60"/>
       </w:pPr>
       <w:r>
-        <w:t>`station_proxy.glb`,</w:t>
+        <w:rPr>
+          <w:rFonts w:ascii="Arial" w:hAnsi="Arial"/>
+          <w:b w:val="0"/>
+          <w:color w:val="111111"/>
+          <w:sz w:val="20"/>
+        </w:rPr>
+        <w:t>Invalid placeholder GLBs are clearly marked or validated.</w:t>
       </w:r>
     </w:p>
     <w:p>
       <w:pPr>
         <w:pStyle w:val="ListBullet"/>
-      </w:pPr>
-      <w:r>
-        <w:t>`train_proxy.glb`,</w:t>
-      </w:r>
-    </w:p>
-    <w:p>
-      <w:pPr>
-        <w:pStyle w:val="ListBullet"/>
-      </w:pPr>
-      <w:r>
-        <w:t>`vending_proxy.glb`.</w:t>
-      </w:r>
-    </w:p>
-    <w:p>
-      <w:r>
-        <w:t>These are placeholders only; replace them gradually.</w:t>
-      </w:r>
-    </w:p>
-    <w:p>
-      <w:pPr>
-        <w:pStyle w:val="Heading2"/>
-      </w:pPr>
-      <w:r>
-        <w:t>`src/main.js`</w:t>
-      </w:r>
-    </w:p>
-    <w:p>
-      <w:r>
-        <w:t>Creates a Three.js scene with:</w:t>
-      </w:r>
-    </w:p>
-    <w:p>
-      <w:pPr>
-        <w:pStyle w:val="ListBullet"/>
-      </w:pPr>
-      <w:r>
-        <w:t>panorama backdrop,</w:t>
-      </w:r>
-    </w:p>
-    <w:p>
-      <w:pPr>
-        <w:pStyle w:val="ListBullet"/>
-      </w:pPr>
-      <w:r>
-        <w:t>simple ground/ocean planes,</w:t>
-      </w:r>
-    </w:p>
-    <w:p>
-      <w:pPr>
-        <w:pStyle w:val="ListBullet"/>
-      </w:pPr>
-      <w:r>
-        <w:t>procedural roads/crosswalks,</w:t>
-      </w:r>
-    </w:p>
-    <w:p>
-      <w:pPr>
-        <w:pStyle w:val="ListBullet"/>
-      </w:pPr>
-      <w:r>
-        <w:t>procedural park blockout,</w:t>
-      </w:r>
-    </w:p>
-    <w:p>
-      <w:pPr>
-        <w:pStyle w:val="ListBullet"/>
-      </w:pPr>
-      <w:r>
-        <w:t>utility pole and wire placeholders,</w:t>
-      </w:r>
-    </w:p>
-    <w:p>
-      <w:pPr>
-        <w:pStyle w:val="ListBullet"/>
-      </w:pPr>
-      <w:r>
-        <w:t>GLB proxy loading,</w:t>
-      </w:r>
-    </w:p>
-    <w:p>
-      <w:pPr>
-        <w:pStyle w:val="ListBullet"/>
-      </w:pPr>
-      <w:r>
-        <w:t>crop-image billboards for visual reference,</w:t>
-      </w:r>
-    </w:p>
-    <w:p>
-      <w:pPr>
-        <w:pStyle w:val="ListBullet"/>
-      </w:pPr>
-      <w:r>
-        <w:t>simple keyboard toggles.</w:t>
-      </w:r>
-    </w:p>
-    <w:p>
-      <w:pPr>
-        <w:pStyle w:val="Heading1"/>
-      </w:pPr>
-      <w:r>
-        <w:t>Human decision points</w:t>
-      </w:r>
-    </w:p>
-    <w:p>
-      <w:r>
-        <w:t xml:space="preserve">Before introducing heavy image-to-3D tools, review </w:t>
-      </w:r>
-      <w:r>
-        <w:rPr>
-          <w:rFonts w:ascii="Consolas" w:hAnsi="Consolas"/>
-          <w:sz w:val="18"/>
-        </w:rPr>
-        <w:t>decisions/asset_review.md</w:t>
-      </w:r>
-      <w:r>
-        <w:t xml:space="preserve"> and decide:</w:t>
-      </w:r>
-    </w:p>
-    <w:p>
-      <w:pPr>
-        <w:pStyle w:val="ListNumber"/>
-      </w:pPr>
-      <w:r>
-        <w:t>Which crop should become the first real AI-generated mesh?</w:t>
-      </w:r>
-    </w:p>
-    <w:p>
-      <w:pPr>
-        <w:pStyle w:val="ListNumber"/>
-      </w:pPr>
-      <w:r>
-        <w:t>Which objects should stay procedural?</w:t>
-      </w:r>
-    </w:p>
-    <w:p>
-      <w:pPr>
-        <w:pStyle w:val="ListNumber"/>
-      </w:pPr>
-      <w:r>
-        <w:t>Whether the final camera should be orbit-only, fixed-path, or walkable.</w:t>
-      </w:r>
-    </w:p>
-    <w:p>
-      <w:pPr>
-        <w:pStyle w:val="ListNumber"/>
-      </w:pPr>
-      <w:r>
-        <w:t>How close the user should be allowed to get to generated meshes.</w:t>
-      </w:r>
-    </w:p>
-    <w:p>
-      <w:pPr>
-        <w:pStyle w:val="ListNumber"/>
-      </w:pPr>
-      <w:r>
-        <w:t>Whether image crops should be used as texture cards, style references, or direct model-generation inputs.</w:t>
-      </w:r>
-    </w:p>
-    <w:p>
-      <w:r>
-        <w:t>Suggested first asset replacement order:</w:t>
-      </w:r>
-    </w:p>
-    <w:p>
-      <w:pPr>
-        <w:pStyle w:val="ListNumber"/>
-      </w:pPr>
-      <w:r>
-        <w:t>Shrine/temple, because it is visually distinctive.</w:t>
-      </w:r>
-    </w:p>
-    <w:p>
-      <w:pPr>
-        <w:pStyle w:val="ListNumber"/>
-      </w:pPr>
-      <w:r>
-        <w:t>Station/train, because it makes the right side feel alive.</w:t>
-      </w:r>
-    </w:p>
-    <w:p>
-      <w:pPr>
-        <w:pStyle w:val="ListNumber"/>
-      </w:pPr>
-      <w:r>
-        <w:t>Blue-roof house, because it can become a reusable modular asset.</w:t>
-      </w:r>
-    </w:p>
-    <w:p>
-      <w:pPr>
-        <w:pStyle w:val="ListNumber"/>
-      </w:pPr>
-      <w:r>
-        <w:t>Vending machine, because it is a good foreground detail.</w:t>
-      </w:r>
-    </w:p>
-    <w:p>
-      <w:pPr>
-        <w:pStyle w:val="ListNumber"/>
-      </w:pPr>
-      <w:r>
-        <w:t>Trees and park props, only if procedural versions feel too generic.</w:t>
-      </w:r>
-    </w:p>
-    <w:p>
-      <w:pPr>
-        <w:pStyle w:val="Heading1"/>
-      </w:pPr>
-      <w:r>
-        <w:t>Recommended next technical iteration</w:t>
-      </w:r>
-    </w:p>
-    <w:p>
-      <w:pPr>
-        <w:pStyle w:val="Heading2"/>
-      </w:pPr>
-      <w:r>
-        <w:t>Phase 1: improve the scaffold</w:t>
-      </w:r>
-    </w:p>
-    <w:p>
-      <w:pPr>
-        <w:pStyle w:val="ListBullet"/>
-      </w:pPr>
-      <w:r>
-        <w:t>Add screenshot capture.</w:t>
-      </w:r>
-    </w:p>
-    <w:p>
-      <w:pPr>
-        <w:pStyle w:val="ListBullet"/>
-      </w:pPr>
-      <w:r>
-        <w:t>Add a simple layout editor mode that writes object transforms back to JSON.</w:t>
-      </w:r>
-    </w:p>
-    <w:p>
-      <w:pPr>
-        <w:pStyle w:val="ListBullet"/>
-      </w:pPr>
-      <w:r>
-        <w:t>Add labels in the world for each asset.</w:t>
-      </w:r>
-    </w:p>
-    <w:p>
-      <w:pPr>
-        <w:pStyle w:val="ListBullet"/>
-      </w:pPr>
-      <w:r>
-        <w:t>Add a style toggle: normal render vs pixelated render pass.</w:t>
-      </w:r>
-    </w:p>
-    <w:p>
-      <w:pPr>
-        <w:pStyle w:val="ListBullet"/>
-      </w:pPr>
-      <w:r>
-        <w:t>Add ambient animation: sea shimmer, train idle movement, crossing lights, cloud drift.</w:t>
-      </w:r>
-    </w:p>
-    <w:p>
-      <w:pPr>
-        <w:pStyle w:val="Heading2"/>
-      </w:pPr>
-      <w:r>
-        <w:t>Phase 2: image-to-3D replacement pipeline</w:t>
-      </w:r>
-    </w:p>
-    <w:p>
-      <w:r>
-        <w:t>Create a new script, for example:</w:t>
-      </w:r>
-    </w:p>
-    <w:p>
-      <w:pPr>
-        <w:spacing w:before="60" w:after="120"/>
-        <w:ind w:left="360"/>
-        <w:shd w:fill="F2F4F7"/>
+        <w:spacing w:after="60"/>
       </w:pPr>
       <w:r>
         <w:rPr>
-          <w:rFonts w:ascii="Consolas" w:hAnsi="Consolas"/>
-          <w:sz w:val="17"/>
+          <w:rFonts w:ascii="Arial" w:hAnsi="Arial"/>
+          <w:b w:val="0"/>
+          <w:color w:val="111111"/>
+          <w:sz w:val="20"/>
         </w:rPr>
-        <w:t>scripts/run_image_to_3d_asset.py</w:t>
-      </w:r>
-    </w:p>
-    <w:p>
-      <w:r>
-        <w:t>It should accept:</w:t>
-      </w:r>
-    </w:p>
-    <w:p>
-      <w:pPr>
-        <w:spacing w:before="60" w:after="120"/>
-        <w:ind w:left="360"/>
-        <w:shd w:fill="F2F4F7"/>
-      </w:pPr>
-      <w:r>
-        <w:rPr>
-          <w:rFonts w:ascii="Consolas" w:hAnsi="Consolas"/>
-          <w:sz w:val="17"/>
-        </w:rPr>
-        <w:t>python scripts/run_image_to_3d_asset.py --asset shrine --backend hunyuan3d</w:t>
-      </w:r>
-    </w:p>
-    <w:p>
-      <w:r>
-        <w:t>Expected output:</w:t>
-      </w:r>
-    </w:p>
-    <w:p>
-      <w:pPr>
-        <w:spacing w:before="60" w:after="120"/>
-        <w:ind w:left="360"/>
-        <w:shd w:fill="F2F4F7"/>
-      </w:pPr>
-      <w:r>
-        <w:rPr>
-          <w:rFonts w:ascii="Consolas" w:hAnsi="Consolas"/>
-          <w:sz w:val="17"/>
-        </w:rPr>
-        <w:t>assets/generated/shrine_raw.glb</w:t>
-        <w:br/>
-        <w:t>assets/generated/shrine_clean.glb</w:t>
-        <w:br/>
-        <w:t>assets/generated/shrine_notes.md</w:t>
-      </w:r>
-    </w:p>
-    <w:p>
-      <w:r>
-        <w:t>Backends to consider:</w:t>
-      </w:r>
-    </w:p>
-    <w:p>
-      <w:pPr>
-        <w:pStyle w:val="ListBullet"/>
-      </w:pPr>
-      <w:r>
-        <w:t>Hunyuan3D for higher-quality image/text-to-3D assets.</w:t>
-      </w:r>
-    </w:p>
-    <w:p>
-      <w:pPr>
-        <w:pStyle w:val="ListBullet"/>
-      </w:pPr>
-      <w:r>
-        <w:t>TRELLIS for high-fidelity generated assets and possible radiance/Gaussian outputs.</w:t>
-      </w:r>
-    </w:p>
-    <w:p>
-      <w:pPr>
-        <w:pStyle w:val="ListBullet"/>
-      </w:pPr>
-      <w:r>
-        <w:t>TripoSR-style pipelines for quick local tests.</w:t>
-      </w:r>
-    </w:p>
-    <w:p>
-      <w:pPr>
-        <w:pStyle w:val="ListBullet"/>
-      </w:pPr>
-      <w:r>
-        <w:t>Blender Python/manual modelling for simple objects.</w:t>
-      </w:r>
-    </w:p>
-    <w:p>
-      <w:pPr>
-        <w:pStyle w:val="Heading2"/>
-      </w:pPr>
-      <w:r>
-        <w:t>Phase 3: Blender cleanup</w:t>
-      </w:r>
-    </w:p>
-    <w:p>
-      <w:r>
-        <w:t>Add a Blender batch-cleanup script:</w:t>
-      </w:r>
-    </w:p>
-    <w:p>
-      <w:pPr>
-        <w:spacing w:before="60" w:after="120"/>
-        <w:ind w:left="360"/>
-        <w:shd w:fill="F2F4F7"/>
-      </w:pPr>
-      <w:r>
-        <w:rPr>
-          <w:rFonts w:ascii="Consolas" w:hAnsi="Consolas"/>
-          <w:sz w:val="17"/>
-        </w:rPr>
-        <w:t>scripts/blender_cleanup.py</w:t>
-      </w:r>
-    </w:p>
-    <w:p>
-      <w:r>
-        <w:t>Target operations:</w:t>
-      </w:r>
-    </w:p>
-    <w:p>
-      <w:pPr>
-        <w:pStyle w:val="ListBullet"/>
-      </w:pPr>
-      <w:r>
-        <w:t>apply scale and origin,</w:t>
-      </w:r>
-    </w:p>
-    <w:p>
-      <w:pPr>
-        <w:pStyle w:val="ListBullet"/>
-      </w:pPr>
-      <w:r>
-        <w:t>decimate if needed,</w:t>
-      </w:r>
-    </w:p>
-    <w:p>
-      <w:pPr>
-        <w:pStyle w:val="ListBullet"/>
-      </w:pPr>
-      <w:r>
-        <w:t>remove loose geometry,</w:t>
-      </w:r>
-    </w:p>
-    <w:p>
-      <w:pPr>
-        <w:pStyle w:val="ListBullet"/>
-      </w:pPr>
-      <w:r>
-        <w:t>simplify materials,</w:t>
-      </w:r>
-    </w:p>
-    <w:p>
-      <w:pPr>
-        <w:pStyle w:val="ListBullet"/>
-      </w:pPr>
-      <w:r>
-        <w:t>bake or resize textures,</w:t>
-      </w:r>
-    </w:p>
-    <w:p>
-      <w:pPr>
-        <w:pStyle w:val="ListBullet"/>
-      </w:pPr>
-      <w:r>
-        <w:t>enforce nearest-neighbour/pixel texture settings where possible,</w:t>
-      </w:r>
-    </w:p>
-    <w:p>
-      <w:pPr>
-        <w:pStyle w:val="ListBullet"/>
-      </w:pPr>
-      <w:r>
-        <w:t>export `.glb`.</w:t>
-      </w:r>
-    </w:p>
-    <w:p>
-      <w:pPr>
-        <w:pStyle w:val="Heading2"/>
-      </w:pPr>
-      <w:r>
-        <w:t>Phase 4: browser renderer polish</w:t>
-      </w:r>
-    </w:p>
-    <w:p>
-      <w:r>
-        <w:t>Keep Three.js unless there is a strong reason to switch. Add:</w:t>
-      </w:r>
-    </w:p>
-    <w:p>
-      <w:pPr>
-        <w:pStyle w:val="ListBullet"/>
-      </w:pPr>
-      <w:r>
-        <w:t>GLB loading progress,</w:t>
-      </w:r>
-    </w:p>
-    <w:p>
-      <w:pPr>
-        <w:pStyle w:val="ListBullet"/>
-      </w:pPr>
-      <w:r>
-        <w:t>asset metadata panel,</w:t>
-      </w:r>
-    </w:p>
-    <w:p>
-      <w:pPr>
-        <w:pStyle w:val="ListBullet"/>
-      </w:pPr>
-      <w:r>
-        <w:t>configurable camera modes,</w:t>
-      </w:r>
-    </w:p>
-    <w:p>
-      <w:pPr>
-        <w:pStyle w:val="ListBullet"/>
-      </w:pPr>
-      <w:r>
-        <w:t>pixelation post-process,</w:t>
-      </w:r>
-    </w:p>
-    <w:p>
-      <w:pPr>
-        <w:pStyle w:val="ListBullet"/>
-      </w:pPr>
-      <w:r>
-        <w:t>texture filtering enforcement,</w:t>
-      </w:r>
-    </w:p>
-    <w:p>
-      <w:pPr>
-        <w:pStyle w:val="ListBullet"/>
-      </w:pPr>
-      <w:r>
-        <w:t>optional orthographic camera mode.</w:t>
-      </w:r>
-    </w:p>
-    <w:p>
-      <w:pPr>
-        <w:pStyle w:val="Heading1"/>
-      </w:pPr>
-      <w:r>
-        <w:t>Style constraints</w:t>
-      </w:r>
-    </w:p>
-    <w:p>
-      <w:pPr>
-        <w:pStyle w:val="ListBullet"/>
-      </w:pPr>
-      <w:r>
-        <w:t>Prefer low-poly silhouette clarity over noisy mesh detail.</w:t>
-      </w:r>
-    </w:p>
-    <w:p>
-      <w:pPr>
-        <w:pStyle w:val="ListBullet"/>
-      </w:pPr>
-      <w:r>
-        <w:t>Prefer simple flat/toon materials.</w:t>
-      </w:r>
-    </w:p>
-    <w:p>
-      <w:pPr>
-        <w:pStyle w:val="ListBullet"/>
-      </w:pPr>
-      <w:r>
-        <w:t>Use nearest-neighbour texture filtering for pixel art.</w:t>
-      </w:r>
-    </w:p>
-    <w:p>
-      <w:pPr>
-        <w:pStyle w:val="ListBullet"/>
-      </w:pPr>
-      <w:r>
-        <w:t>Avoid realistic PBR shine except for tiny window/water accents.</w:t>
-      </w:r>
-    </w:p>
-    <w:p>
-      <w:pPr>
-        <w:pStyle w:val="ListBullet"/>
-      </w:pPr>
-      <w:r>
-        <w:t>Keep colours close to `assets/source/palette_32_preview.png`.</w:t>
-      </w:r>
-    </w:p>
-    <w:p>
-      <w:pPr>
-        <w:pStyle w:val="ListBullet"/>
-      </w:pPr>
-      <w:r>
-        <w:t>Preserve the readable composition of the original panorama.</w:t>
-      </w:r>
-    </w:p>
-    <w:p>
-      <w:pPr>
-        <w:pStyle w:val="Heading1"/>
-      </w:pPr>
-      <w:r>
-        <w:t>Risks</w:t>
-      </w:r>
-    </w:p>
-    <w:p>
-      <w:pPr>
-        <w:pStyle w:val="ListBullet"/>
-      </w:pPr>
-      <w:r>
-        <w:t>Single-image-to-3D outputs may hallucinate backs/sides of objects.</w:t>
-      </w:r>
-    </w:p>
-    <w:p>
-      <w:pPr>
-        <w:pStyle w:val="ListBullet"/>
-      </w:pPr>
-      <w:r>
-        <w:t>Generated meshes may be too organic or lumpy for pixel art.</w:t>
-      </w:r>
-    </w:p>
-    <w:p>
-      <w:pPr>
-        <w:pStyle w:val="ListBullet"/>
-      </w:pPr>
-      <w:r>
-        <w:t>Crops may include too much background; manual masks may be needed.</w:t>
-      </w:r>
-    </w:p>
-    <w:p>
-      <w:pPr>
-        <w:pStyle w:val="ListBullet"/>
-      </w:pPr>
-      <w:r>
-        <w:t>Whole-scene 3D generation is likely to be inconsistent.</w:t>
-      </w:r>
-    </w:p>
-    <w:p>
-      <w:pPr>
-        <w:pStyle w:val="ListBullet"/>
-      </w:pPr>
-      <w:r>
-        <w:t>Browser performance will suffer if raw generated meshes are not cleaned and decimated.</w:t>
-      </w:r>
-    </w:p>
-    <w:p>
-      <w:pPr>
-        <w:pStyle w:val="Heading1"/>
-      </w:pPr>
-      <w:r>
-        <w:t>Definition of done for the next milestone</w:t>
-      </w:r>
-    </w:p>
-    <w:p>
-      <w:r>
-        <w:t>A good next milestone is:</w:t>
-      </w:r>
-    </w:p>
-    <w:p>
-      <w:pPr>
-        <w:pStyle w:val="ListBullet"/>
-      </w:pPr>
-      <w:r>
-        <w:t>one proxy asset replaced by a generated or manually cleaned GLB,</w:t>
-      </w:r>
-    </w:p>
-    <w:p>
-      <w:pPr>
-        <w:pStyle w:val="ListBullet"/>
-      </w:pPr>
-      <w:r>
-        <w:t>the browser scene still loads without a build step,</w:t>
-      </w:r>
-    </w:p>
-    <w:p>
-      <w:pPr>
-        <w:pStyle w:val="ListBullet"/>
-      </w:pPr>
-      <w:r>
-        <w:t>the new asset has acceptable scale/origin,</w:t>
-      </w:r>
-    </w:p>
-    <w:p>
-      <w:pPr>
-        <w:pStyle w:val="ListBullet"/>
-      </w:pPr>
-      <w:r>
-        <w:t>textures read as pixel-art-compatible,</w:t>
-      </w:r>
-    </w:p>
-    <w:p>
-      <w:pPr>
-        <w:pStyle w:val="ListBullet"/>
-      </w:pPr>
-      <w:r>
-        <w:t>`scene/town_layout.json` remains the source of truth for placement,</w:t>
-      </w:r>
-    </w:p>
-    <w:p>
-      <w:pPr>
-        <w:pStyle w:val="ListBullet"/>
-      </w:pPr>
-      <w:r>
-        <w:t>human notes are added for whether the asset is worth keeping.</w:t>
-      </w:r>
-    </w:p>
-    <w:p>
-      <w:pPr>
-        <w:pStyle w:val="Heading1"/>
-      </w:pPr>
-      <w:r>
-        <w:t>Suggested Codex prompt</w:t>
-      </w:r>
-    </w:p>
-    <w:p>
-      <w:r>
-        <w:t xml:space="preserve">Use this folder as the working project. Keep the current no-build Three.js static app working. First inspect the scripts and scene layout. Then improve the POC in small commits: add a screenshot capture button, add object labels, and add a simple pixelated post-process or low-resolution render mode. Do not replace the existing image source. Preserve the </w:t>
-      </w:r>
-      <w:r>
-        <w:rPr>
-          <w:rFonts w:ascii="Consolas" w:hAnsi="Consolas"/>
-          <w:sz w:val="18"/>
-        </w:rPr>
-        <w:t>scripts/run_local.sh</w:t>
-      </w:r>
-      <w:r>
-        <w:t xml:space="preserve"> workflow. After that, add a stubbed </w:t>
-      </w:r>
-      <w:r>
-        <w:rPr>
-          <w:rFonts w:ascii="Consolas" w:hAnsi="Consolas"/>
-          <w:sz w:val="18"/>
-        </w:rPr>
-        <w:t>scripts/run_image_to_3d_asset.py</w:t>
-      </w:r>
-      <w:r>
-        <w:t xml:space="preserve"> interface for replacing one proxy GLB at a time with generated assets, but do not assume any heavyweight model is installed unless explicitly configured.</w:t>
+        <w:t>The docs describe the actual repository state.</w:t>
       </w:r>
     </w:p>
     <w:sectPr>
-      <w:footerReference w:type="default" r:id="rId9"/>
       <w:pgSz w:w="12240" w:h="15840"/>
-      <w:pgMar w:top="864" w:right="1008" w:bottom="864" w:left="1008" w:header="720" w:footer="720" w:gutter="0"/>
+      <w:pgMar w:top="1080" w:right="1224" w:bottom="1080" w:left="1224" w:header="720" w:footer="720" w:gutter="0"/>
       <w:cols w:space="720"/>
       <w:docGrid w:linePitch="360"/>
     </w:sectPr>
   </w:body>
 </w:document>
-</file>
-
-<file path=word/footer1.xml><?xml version="1.0" encoding="utf-8"?>
-<w:ftr xmlns:m="http://schemas.openxmlformats.org/officeDocument/2006/math" xmlns:mc="http://schemas.openxmlformats.org/markup-compatibility/2006" xmlns:mo="http://schemas.microsoft.com/office/mac/office/2008/main" xmlns:mv="urn:schemas-microsoft-com:mac:vml" xmlns:o="urn:schemas-microsoft-com:office:office" xmlns:r="http://schemas.openxmlformats.org/officeDocument/2006/relationships" xmlns:v="urn:schemas-microsoft-com:vml" xmlns:w10="urn:schemas-microsoft-com:office:word" xmlns:w14="http://schemas.microsoft.com/office/word/2010/wordml" xmlns:w="http://schemas.openxmlformats.org/wordprocessingml/2006/main" xmlns:wne="http://schemas.microsoft.com/office/word/2006/wordml" xmlns:wp14="http://schemas.microsoft.com/office/word/2010/wordprocessingDrawing" xmlns:wp="http://schemas.openxmlformats.org/drawingml/2006/wordprocessingDrawing" xmlns:wpc="http://schemas.microsoft.com/office/word/2010/wordprocessingCanvas" xmlns:wpg="http://schemas.microsoft.com/office/word/2010/wordprocessingGroup" xmlns:wpi="http://schemas.microsoft.com/office/word/2010/wordprocessingInk" xmlns:wps="http://schemas.microsoft.com/office/word/2010/wordprocessingShape" mc:Ignorable="w14 wp14">
-  <w:p>
-    <w:pPr>
-      <w:pStyle w:val="Footer"/>
-      <w:jc w:val="center"/>
-    </w:pPr>
-    <w:r>
-      <w:t>Pixel Town 3D Asset POC handoff</w:t>
-    </w:r>
-  </w:p>
-</w:ftr>
 </file>
 
 <file path=word/numbering.xml><?xml version="1.0" encoding="utf-8"?>
@@ -1486,10 +1031,6 @@
     <w:name w:val="Normal"/>
     <w:qFormat/>
     <w:rsid w:val="00FC693F"/>
-    <w:rPr>
-      <w:rFonts w:ascii="Aptos" w:hAnsi="Aptos"/>
-      <w:sz w:val="20"/>
-    </w:rPr>
   </w:style>
   <w:style w:type="paragraph" w:styleId="Header">
     <w:name w:val="header"/>
@@ -1550,11 +1091,11 @@
       <w:outlineLvl w:val="0"/>
     </w:pPr>
     <w:rPr>
-      <w:rFonts w:asciiTheme="majorHAnsi" w:eastAsiaTheme="majorEastAsia" w:hAnsiTheme="majorHAnsi" w:cstheme="majorBidi" w:ascii="Aptos Display" w:hAnsi="Aptos Display"/>
+      <w:rFonts w:asciiTheme="majorHAnsi" w:eastAsiaTheme="majorEastAsia" w:hAnsiTheme="majorHAnsi" w:cstheme="majorBidi"/>
       <w:b/>
       <w:bCs/>
       <w:color w:val="365F91" w:themeColor="accent1" w:themeShade="BF"/>
-      <w:sz w:val="36"/>
+      <w:sz w:val="28"/>
       <w:szCs w:val="28"/>
     </w:rPr>
   </w:style>
@@ -1574,11 +1115,11 @@
       <w:outlineLvl w:val="1"/>
     </w:pPr>
     <w:rPr>
-      <w:rFonts w:asciiTheme="majorHAnsi" w:eastAsiaTheme="majorEastAsia" w:hAnsiTheme="majorHAnsi" w:cstheme="majorBidi" w:ascii="Aptos Display" w:hAnsi="Aptos Display"/>
+      <w:rFonts w:asciiTheme="majorHAnsi" w:eastAsiaTheme="majorEastAsia" w:hAnsiTheme="majorHAnsi" w:cstheme="majorBidi"/>
       <w:b/>
       <w:bCs/>
       <w:color w:val="4F81BD" w:themeColor="accent1"/>
-      <w:sz w:val="28"/>
+      <w:sz w:val="26"/>
       <w:szCs w:val="26"/>
     </w:rPr>
   </w:style>
@@ -1598,11 +1139,10 @@
       <w:outlineLvl w:val="2"/>
     </w:pPr>
     <w:rPr>
-      <w:rFonts w:asciiTheme="majorHAnsi" w:eastAsiaTheme="majorEastAsia" w:hAnsiTheme="majorHAnsi" w:cstheme="majorBidi" w:ascii="Aptos Display" w:hAnsi="Aptos Display"/>
+      <w:rFonts w:asciiTheme="majorHAnsi" w:eastAsiaTheme="majorEastAsia" w:hAnsiTheme="majorHAnsi" w:cstheme="majorBidi"/>
       <w:b/>
       <w:bCs/>
       <w:color w:val="4F81BD" w:themeColor="accent1"/>
-      <w:sz w:val="24"/>
     </w:rPr>
   </w:style>
   <w:style w:type="paragraph" w:styleId="Heading4">

</xml_diff>

<commit_message>
Run first real TripoSR asset
</commit_message>
<xml_diff>
--- a/docs/Pixel_Town_3D_POC_Handoff.docx
+++ b/docs/Pixel_Town_3D_POC_Handoff.docx
@@ -29,7 +29,7 @@
           <w:color w:val="555555"/>
           <w:sz w:val="20"/>
         </w:rPr>
-        <w:t>Current Codex handoff and implementation brief</w:t>
+        <w:t>Current Codex handoff after first real TripoSR run</w:t>
       </w:r>
     </w:p>
     <w:p>
@@ -72,7 +72,7 @@
           <w:color w:val="111111"/>
           <w:sz w:val="20"/>
         </w:rPr>
-        <w:t>The current repository is focused on pipeline scaffolding. It does not yet contain the full Three.js world implementation or source panorama assets.</w:t>
+        <w:t>The current repository now contains the source panorama, real crop generation, and a working local TripoSR backend hook. The browser viewer is still a future or restoration task.</w:t>
       </w:r>
     </w:p>
     <w:p>
@@ -98,12 +98,27 @@
       <w:r>
         <w:rPr>
           <w:rFonts w:ascii="Consolas" w:hAnsi="Consolas"/>
+          <w:b w:val="0"/>
           <w:color w:val="333333"/>
-          <w:sz w:val="17"/>
+          <w:sz w:val="16"/>
         </w:rPr>
         <w:t>pixel-town-poc/</w:t>
         <w:br/>
         <w:t xml:space="preserve">  index.html</w:t>
+        <w:br/>
+        <w:t xml:space="preserve">  assets/source/panorama.png</w:t>
+        <w:br/>
+        <w:t xml:space="preserve">  assets/scene_parse.json</w:t>
+        <w:br/>
+        <w:t xml:space="preserve">  assets/asset_routes.json</w:t>
+        <w:br/>
+        <w:t xml:space="preserve">  assets/intermediate/shrine_01_clean.png</w:t>
+        <w:br/>
+        <w:t xml:space="preserve">  assets/generated/shrine_01_raw.glb</w:t>
+        <w:br/>
+        <w:t xml:space="preserve">  assets/generated/shrine_01_raw_input.png</w:t>
+        <w:br/>
+        <w:t xml:space="preserve">  assets/generated/shrine_01_preview.png</w:t>
         <w:br/>
         <w:t xml:space="preserve">  scripts/parse_scene.py</w:t>
         <w:br/>
@@ -112,22 +127,6 @@
         <w:t xml:space="preserve">  scripts/generate_clean_asset_image.py</w:t>
         <w:br/>
         <w:t xml:space="preserve">  scripts/run_image_to_3d_asset.py</w:t>
-        <w:br/>
-        <w:t xml:space="preserve">  assets/scene_parse.json</w:t>
-        <w:br/>
-        <w:t xml:space="preserve">  assets/asset_routes.json</w:t>
-        <w:br/>
-        <w:t xml:space="preserve">  assets/intermediate/shrine_01_clean.txt</w:t>
-        <w:br/>
-        <w:t xml:space="preserve">  assets/intermediate/shrine_01_clean_meta.json</w:t>
-        <w:br/>
-        <w:t xml:space="preserve">  assets/generated/shrine_01_raw.glb</w:t>
-        <w:br/>
-        <w:t xml:space="preserve">  assets/generated/shrine_01_generation_meta.json</w:t>
-        <w:br/>
-        <w:t xml:space="preserve">  assets/generated/shrine_01_notes.md</w:t>
-        <w:br/>
-        <w:t xml:space="preserve">  docs/SCRIPT_INTERFACES.md</w:t>
       </w:r>
     </w:p>
     <w:p>
@@ -141,7 +140,7 @@
           <w:color w:val="111111"/>
           <w:sz w:val="20"/>
         </w:rPr>
-        <w:t>index.html is present but references ./src/main.js, which is not in this checkout. Treat the browser viewer as a future or restoration task.</w:t>
+        <w:t>index.html references ./src/main.js, which is not present. Treat the browser viewer as future work.</w:t>
       </w:r>
     </w:p>
     <w:p>
@@ -156,7 +155,7 @@
           <w:color w:val="16324F"/>
           <w:sz w:val="32"/>
         </w:rPr>
-        <w:t>Current Working Pipeline</w:t>
+        <w:t>Working Pipeline</w:t>
       </w:r>
     </w:p>
     <w:p>
@@ -167,8 +166,9 @@
       <w:r>
         <w:rPr>
           <w:rFonts w:ascii="Consolas" w:hAnsi="Consolas"/>
+          <w:b w:val="0"/>
           <w:color w:val="333333"/>
-          <w:sz w:val="17"/>
+          <w:sz w:val="16"/>
         </w:rPr>
         <w:t>python3 scripts/parse_scene.py --image assets/source/panorama.png --out assets/scene_parse.json</w:t>
         <w:br/>
@@ -176,7 +176,7 @@
         <w:br/>
         <w:t>python3 scripts/generate_clean_asset_image.py --asset shrine_01 --scene assets/scene_parse.json --mode clean-render --outdir assets/intermediate</w:t>
         <w:br/>
-        <w:t>python3 scripts/run_image_to_3d_asset.py --asset shrine_01 --scene assets/scene_parse.json --routes assets/asset_routes.json --mode clean-render --backend stub --outdir assets/generated</w:t>
+        <w:t>python3 scripts/run_image_to_3d_asset.py --asset shrine_01 --scene assets/scene_parse.json --routes assets/asset_routes.json --mode clean-render --backend tripo --outdir assets/generated --tripo-repo /tmp/triposr-run --tripo-python /tmp/triposr-venv/bin/python --device cpu --mc-resolution 128 --chunk-size 4096</w:t>
       </w:r>
     </w:p>
     <w:p>
@@ -190,7 +190,97 @@
           <w:color w:val="111111"/>
           <w:sz w:val="20"/>
         </w:rPr>
-        <w:t>The parser currently records the --image path as metadata only; it does not open or validate the image file.</w:t>
+        <w:t>The parser validates the image and emits pixel-space bounding boxes. The clean-image step currently creates a real source crop, not a generated isolated asset render.</w:t>
+      </w:r>
+    </w:p>
+    <w:p>
+      <w:pPr>
+        <w:pStyle w:val="Heading1"/>
+        <w:spacing w:before="280" w:after="100"/>
+      </w:pPr>
+      <w:r>
+        <w:rPr>
+          <w:rFonts w:ascii="Arial" w:hAnsi="Arial"/>
+          <w:b/>
+          <w:color w:val="16324F"/>
+          <w:sz w:val="32"/>
+        </w:rPr>
+        <w:t>First Real Output</w:t>
+      </w:r>
+    </w:p>
+    <w:p>
+      <w:pPr>
+        <w:pStyle w:val="ListBullet"/>
+        <w:spacing w:after="60"/>
+      </w:pPr>
+      <w:r>
+        <w:rPr>
+          <w:rFonts w:ascii="Arial" w:hAnsi="Arial"/>
+          <w:b w:val="0"/>
+          <w:color w:val="111111"/>
+          <w:sz w:val="20"/>
+        </w:rPr>
+        <w:t>TripoSR generated a valid GLB at assets/generated/shrine_01_raw.glb.</w:t>
+      </w:r>
+    </w:p>
+    <w:p>
+      <w:pPr>
+        <w:pStyle w:val="ListBullet"/>
+        <w:spacing w:after="60"/>
+      </w:pPr>
+      <w:r>
+        <w:rPr>
+          <w:rFonts w:ascii="Arial" w:hAnsi="Arial"/>
+          <w:b w:val="0"/>
+          <w:color w:val="111111"/>
+          <w:sz w:val="20"/>
+        </w:rPr>
+        <w:t>The mesh contains one geometry with 5,048 vertices and 10,056 faces.</w:t>
+      </w:r>
+    </w:p>
+    <w:p>
+      <w:pPr>
+        <w:pStyle w:val="ListBullet"/>
+        <w:spacing w:after="60"/>
+      </w:pPr>
+      <w:r>
+        <w:rPr>
+          <w:rFonts w:ascii="Arial" w:hAnsi="Arial"/>
+          <w:b w:val="0"/>
+          <w:color w:val="111111"/>
+          <w:sz w:val="20"/>
+        </w:rPr>
+        <w:t>assets/generated/shrine_01_raw_input.png records the processed input used by TripoSR.</w:t>
+      </w:r>
+    </w:p>
+    <w:p>
+      <w:pPr>
+        <w:pStyle w:val="ListBullet"/>
+        <w:spacing w:after="60"/>
+      </w:pPr>
+      <w:r>
+        <w:rPr>
+          <w:rFonts w:ascii="Arial" w:hAnsi="Arial"/>
+          <w:b w:val="0"/>
+          <w:color w:val="111111"/>
+          <w:sz w:val="20"/>
+        </w:rPr>
+        <w:t>assets/generated/shrine_01_preview.png is a lightweight local preview render.</w:t>
+      </w:r>
+    </w:p>
+    <w:p>
+      <w:pPr>
+        <w:pStyle w:val="ListBullet"/>
+        <w:spacing w:after="60"/>
+      </w:pPr>
+      <w:r>
+        <w:rPr>
+          <w:rFonts w:ascii="Arial" w:hAnsi="Arial"/>
+          <w:b w:val="0"/>
+          <w:color w:val="111111"/>
+          <w:sz w:val="20"/>
+        </w:rPr>
+        <w:t>Quality note: the mesh mostly captures the shrine roof mass and needs a cleaner isolated input plus cleanup.</w:t>
       </w:r>
     </w:p>
     <w:p>
@@ -220,7 +310,7 @@
           <w:color w:val="111111"/>
           <w:sz w:val="20"/>
         </w:rPr>
-        <w:t>Stub scene parser that emits a deterministic starter object inventory.</w:t>
+        <w:t>Source panorama stored at assets/source/panorama.png.</w:t>
       </w:r>
     </w:p>
     <w:p>
@@ -235,7 +325,7 @@
           <w:color w:val="111111"/>
           <w:sz w:val="20"/>
         </w:rPr>
-        <w:t>Stub asset router that assigns each object to a generation strategy.</w:t>
+        <w:t>Scene parser validates image dimensions and writes bbox_pixels.</w:t>
       </w:r>
     </w:p>
     <w:p>
@@ -250,7 +340,7 @@
           <w:color w:val="111111"/>
           <w:sz w:val="20"/>
         </w:rPr>
-        <w:t>Stub clean-asset-image generator that writes prompt metadata and a text placeholder.</w:t>
+        <w:t>Clean-image step can create a real crop PNG from source art.</w:t>
       </w:r>
     </w:p>
     <w:p>
@@ -265,7 +355,7 @@
           <w:color w:val="111111"/>
           <w:sz w:val="20"/>
         </w:rPr>
-        <w:t>Stub image-to-3D runner that writes placeholder GLB bytes, metadata, and notes.</w:t>
+        <w:t>Image-to-3D runner supports --backend stub and --backend tripo.</w:t>
       </w:r>
     </w:p>
     <w:p>
@@ -280,7 +370,7 @@
           <w:color w:val="111111"/>
           <w:sz w:val="20"/>
         </w:rPr>
-        <w:t>Sample generated outputs for shrine_01.</w:t>
+        <w:t>A first real TripoSR smoke test completed on Apple M4 CPU.</w:t>
       </w:r>
     </w:p>
     <w:p>
@@ -295,7 +385,7 @@
           <w:color w:val="16324F"/>
           <w:sz w:val="32"/>
         </w:rPr>
-        <w:t>Not Implemented Yet</w:t>
+        <w:t>Still Missing</w:t>
       </w:r>
     </w:p>
     <w:p>
@@ -325,7 +415,7 @@
           <w:color w:val="111111"/>
           <w:sz w:val="20"/>
         </w:rPr>
-        <w:t>Real image generation for clean intermediate asset images.</w:t>
+        <w:t>Generated clean isolated asset images.</w:t>
       </w:r>
     </w:p>
     <w:p>
@@ -340,37 +430,7 @@
           <w:color w:val="111111"/>
           <w:sz w:val="20"/>
         </w:rPr>
-        <w:t>Real image-to-3D backend invocation.</w:t>
-      </w:r>
-    </w:p>
-    <w:p>
-      <w:pPr>
-        <w:pStyle w:val="ListBullet"/>
-        <w:spacing w:after="60"/>
-      </w:pPr>
-      <w:r>
-        <w:rPr>
-          <w:rFonts w:ascii="Arial" w:hAnsi="Arial"/>
-          <w:b w:val="0"/>
-          <w:color w:val="111111"/>
-          <w:sz w:val="20"/>
-        </w:rPr>
-        <w:t>Valid generated GLB geometry.</w:t>
-      </w:r>
-    </w:p>
-    <w:p>
-      <w:pPr>
-        <w:pStyle w:val="ListBullet"/>
-        <w:spacing w:after="60"/>
-      </w:pPr>
-      <w:r>
-        <w:rPr>
-          <w:rFonts w:ascii="Arial" w:hAnsi="Arial"/>
-          <w:b w:val="0"/>
-          <w:color w:val="111111"/>
-          <w:sz w:val="20"/>
-        </w:rPr>
-        <w:t>Blender cleanup and normalisation.</w:t>
+        <w:t>Mesh cleanup, origin/scale normalisation, and decimation policy.</w:t>
       </w:r>
     </w:p>
     <w:p>
@@ -400,7 +460,7 @@
           <w:color w:val="111111"/>
           <w:sz w:val="20"/>
         </w:rPr>
-        <w:t>Source panorama and crop-generation assets in this checkout.</w:t>
+        <w:t>Automated GLB validation and visual review gates.</w:t>
       </w:r>
     </w:p>
     <w:p>
@@ -430,7 +490,7 @@
           <w:color w:val="111111"/>
           <w:sz w:val="20"/>
         </w:rPr>
-        <w:t>Add or restore assets/source/panorama.png.</w:t>
+        <w:t>Create a cleaner isolated shrine image without stairs, trees, or torii unless intentionally included.</w:t>
       </w:r>
     </w:p>
     <w:p>
@@ -445,7 +505,7 @@
           <w:color w:val="111111"/>
           <w:sz w:val="20"/>
         </w:rPr>
-        <w:t>Add validation that distinguishes placeholder GLB files from valid GLB assets.</w:t>
+        <w:t>Rerun TripoSR at higher resolution and compare mesh quality.</w:t>
       </w:r>
     </w:p>
     <w:p>
@@ -460,7 +520,7 @@
           <w:color w:val="111111"/>
           <w:sz w:val="20"/>
         </w:rPr>
-        <w:t>Connect one real clean-image backend while preserving --backend stub.</w:t>
+        <w:t>Add a cleanup script for scale, origin, orientation, and material simplification.</w:t>
       </w:r>
     </w:p>
     <w:p>
@@ -475,7 +535,7 @@
           <w:color w:val="111111"/>
           <w:sz w:val="20"/>
         </w:rPr>
-        <w:t>Connect one real image-to-3D backend while preserving --backend stub.</w:t>
+        <w:t>Add GLB validation so placeholder and generated outputs are clearly distinguished.</w:t>
       </w:r>
     </w:p>
     <w:p>
@@ -491,171 +551,6 @@
           <w:sz w:val="20"/>
         </w:rPr>
         <w:t>Rebuild or restore the Three.js viewer under src/main.js.</w:t>
-      </w:r>
-    </w:p>
-    <w:p>
-      <w:pPr>
-        <w:pStyle w:val="Heading1"/>
-        <w:spacing w:before="280" w:after="100"/>
-      </w:pPr>
-      <w:r>
-        <w:rPr>
-          <w:rFonts w:ascii="Arial" w:hAnsi="Arial"/>
-          <w:b/>
-          <w:color w:val="16324F"/>
-          <w:sz w:val="32"/>
-        </w:rPr>
-        <w:t>Human Decision Points</w:t>
-      </w:r>
-    </w:p>
-    <w:p>
-      <w:pPr>
-        <w:pStyle w:val="ListBullet"/>
-        <w:spacing w:after="60"/>
-      </w:pPr>
-      <w:r>
-        <w:rPr>
-          <w:rFonts w:ascii="Arial" w:hAnsi="Arial"/>
-          <w:b w:val="0"/>
-          <w:color w:val="111111"/>
-          <w:sz w:val="20"/>
-        </w:rPr>
-        <w:t>Confirm whether the stub scene inventory has the right objects and priorities.</w:t>
-      </w:r>
-    </w:p>
-    <w:p>
-      <w:pPr>
-        <w:pStyle w:val="ListBullet"/>
-        <w:spacing w:after="60"/>
-      </w:pPr>
-      <w:r>
-        <w:rPr>
-          <w:rFonts w:ascii="Arial" w:hAnsi="Arial"/>
-          <w:b w:val="0"/>
-          <w:color w:val="111111"/>
-          <w:sz w:val="20"/>
-        </w:rPr>
-        <w:t>Confirm whether each object route is correct.</w:t>
-      </w:r>
-    </w:p>
-    <w:p>
-      <w:pPr>
-        <w:pStyle w:val="ListBullet"/>
-        <w:spacing w:after="60"/>
-      </w:pPr>
-      <w:r>
-        <w:rPr>
-          <w:rFonts w:ascii="Arial" w:hAnsi="Arial"/>
-          <w:b w:val="0"/>
-          <w:color w:val="111111"/>
-          <w:sz w:val="20"/>
-        </w:rPr>
-        <w:t>Choose the first real backend test asset: shrine_01, house_blue_01, or vending_machine_01.</w:t>
-      </w:r>
-    </w:p>
-    <w:p>
-      <w:pPr>
-        <w:pStyle w:val="ListBullet"/>
-        <w:spacing w:after="60"/>
-      </w:pPr>
-      <w:r>
-        <w:rPr>
-          <w:rFonts w:ascii="Arial" w:hAnsi="Arial"/>
-          <w:b w:val="0"/>
-          <w:color w:val="111111"/>
-          <w:sz w:val="20"/>
-        </w:rPr>
-        <w:t>Decide whether to prioritize the browser viewer or real asset generation next.</w:t>
-      </w:r>
-    </w:p>
-    <w:p>
-      <w:pPr>
-        <w:pStyle w:val="Heading1"/>
-        <w:spacing w:before="280" w:after="100"/>
-      </w:pPr>
-      <w:r>
-        <w:rPr>
-          <w:rFonts w:ascii="Arial" w:hAnsi="Arial"/>
-          <w:b/>
-          <w:color w:val="16324F"/>
-          <w:sz w:val="32"/>
-        </w:rPr>
-        <w:t>Definition Of Done For The Next Milestone</w:t>
-      </w:r>
-    </w:p>
-    <w:p>
-      <w:pPr>
-        <w:pStyle w:val="ListBullet"/>
-        <w:spacing w:after="60"/>
-      </w:pPr>
-      <w:r>
-        <w:rPr>
-          <w:rFonts w:ascii="Arial" w:hAnsi="Arial"/>
-          <w:b w:val="0"/>
-          <w:color w:val="111111"/>
-          <w:sz w:val="20"/>
-        </w:rPr>
-        <w:t>One real backend path is wired behind the existing CLI.</w:t>
-      </w:r>
-    </w:p>
-    <w:p>
-      <w:pPr>
-        <w:pStyle w:val="ListBullet"/>
-        <w:spacing w:after="60"/>
-      </w:pPr>
-      <w:r>
-        <w:rPr>
-          <w:rFonts w:ascii="Arial" w:hAnsi="Arial"/>
-          <w:b w:val="0"/>
-          <w:color w:val="111111"/>
-          <w:sz w:val="20"/>
-        </w:rPr>
-        <w:t>--backend stub still works for fast tests.</w:t>
-      </w:r>
-    </w:p>
-    <w:p>
-      <w:pPr>
-        <w:pStyle w:val="ListBullet"/>
-        <w:spacing w:after="60"/>
-      </w:pPr>
-      <w:r>
-        <w:rPr>
-          <w:rFonts w:ascii="Arial" w:hAnsi="Arial"/>
-          <w:b w:val="0"/>
-          <w:color w:val="111111"/>
-          <w:sz w:val="20"/>
-        </w:rPr>
-        <w:t>Generated artifacts include metadata and review notes.</w:t>
-      </w:r>
-    </w:p>
-    <w:p>
-      <w:pPr>
-        <w:pStyle w:val="ListBullet"/>
-        <w:spacing w:after="60"/>
-      </w:pPr>
-      <w:r>
-        <w:rPr>
-          <w:rFonts w:ascii="Arial" w:hAnsi="Arial"/>
-          <w:b w:val="0"/>
-          <w:color w:val="111111"/>
-          <w:sz w:val="20"/>
-        </w:rPr>
-        <w:t>Invalid placeholder GLBs are clearly marked or validated.</w:t>
-      </w:r>
-    </w:p>
-    <w:p>
-      <w:pPr>
-        <w:pStyle w:val="ListBullet"/>
-        <w:spacing w:after="60"/>
-      </w:pPr>
-      <w:r>
-        <w:rPr>
-          <w:rFonts w:ascii="Arial" w:hAnsi="Arial"/>
-          <w:b w:val="0"/>
-          <w:color w:val="111111"/>
-          <w:sz w:val="20"/>
-        </w:rPr>
-        <w:t>The docs describe the actual repository state.</w:t>
       </w:r>
     </w:p>
     <w:sectPr>

</xml_diff>